<commit_message>
Finalize K-Means report and presentation with verified quality results
</commit_message>
<xml_diff>
--- a/docs/final_submission/Group7_Parallel_KMeans_Final_Report.docx
+++ b/docs/final_submission/Group7_Parallel_KMeans_Final_Report.docx
@@ -14439,7 +14439,7 @@
           <w:rFonts w:cs="Times New Roman"/>
           <w:sz w:val="24"/>
         </w:rPr>
-        <w:t>Second, future work should expand the completed 1,000-record KDD99 evaluation to larger, independently validated samples, investigate class imbalance and preprocessing, and assess whether clustering agreement improves under alternative feature choices. Such an experiment would require appropriate preprocessing and careful consideration of the dataset’s characteristics. No results from this dataset are claimed in the present study.</w:t>
+        <w:t>Second, future work should expand the completed 1,000-record KDD99 evaluation to larger, independently validated samples, investigate class imbalance and preprocessing, and assess whether clustering agreement improves under alternative feature choices. Such an experiment would require appropriate preprocessing and careful consideration of the dataset’s characteristics. The present study reports results from the 1,000-record KDD99 sample, but not from larger KDD99 datasets.</w:t>
       </w:r>
     </w:p>
     <w:p>
@@ -14708,6 +14708,482 @@
           <w:sz w:val="24"/>
         </w:rPr>
         <w:t>The project therefore provides a working implementation and an experimental foundation for further investigation of scalable K-Means clustering using Apache Spark.</w:t>
+      </w:r>
+    </w:p>
+    <w:p>
+      <w:pPr>
+        <w:pStyle w:val="Heading2"/>
+      </w:pPr>
+      <w:r>
+        <w:t>Supplementary Verification: Independent Cluster-Quality Check</w:t>
+      </w:r>
+    </w:p>
+    <w:p>
+      <w:r>
+        <w:t>An additional four-run verification was performed after the 42-run controlled study. Each verification run used 1,000 records, two Spark partitions, seed 42, five clusters, and Spark local[1] or local[2]. The KDD99 verification therefore used five clusters, unlike the four-cluster KDD99 configuration in the controlled study; results from these studies should not be pooled or interpreted as identical configurations.</w:t>
+      </w:r>
+    </w:p>
+    <w:tbl>
+      <w:tblPr>
+        <w:tblW w:type="auto" w:w="0"/>
+        <w:tblLook w:firstColumn="1" w:firstRow="1" w:lastColumn="0" w:lastRow="0" w:noHBand="0" w:noVBand="1" w:val="04A0"/>
+      </w:tblPr>
+      <w:tblGrid>
+        <w:gridCol w:w="1560"/>
+        <w:gridCol w:w="1560"/>
+        <w:gridCol w:w="1560"/>
+        <w:gridCol w:w="1560"/>
+        <w:gridCol w:w="1560"/>
+        <w:gridCol w:w="1560"/>
+      </w:tblGrid>
+      <w:tr>
+        <w:tc>
+          <w:tcPr>
+            <w:tcW w:type="dxa" w:w="1560"/>
+          </w:tcPr>
+          <w:p>
+            <w:r>
+              <w:t>Dataset</w:t>
+            </w:r>
+          </w:p>
+        </w:tc>
+        <w:tc>
+          <w:tcPr>
+            <w:tcW w:type="dxa" w:w="1560"/>
+          </w:tcPr>
+          <w:p>
+            <w:r>
+              <w:t>Method</w:t>
+            </w:r>
+          </w:p>
+        </w:tc>
+        <w:tc>
+          <w:tcPr>
+            <w:tcW w:type="dxa" w:w="1560"/>
+          </w:tcPr>
+          <w:p>
+            <w:r>
+              <w:t>SSE</w:t>
+            </w:r>
+          </w:p>
+        </w:tc>
+        <w:tc>
+          <w:tcPr>
+            <w:tcW w:type="dxa" w:w="1560"/>
+          </w:tcPr>
+          <w:p>
+            <w:r>
+              <w:t>Purity</w:t>
+            </w:r>
+          </w:p>
+        </w:tc>
+        <w:tc>
+          <w:tcPr>
+            <w:tcW w:type="dxa" w:w="1560"/>
+          </w:tcPr>
+          <w:p>
+            <w:r>
+              <w:t>ARI</w:t>
+            </w:r>
+          </w:p>
+        </w:tc>
+        <w:tc>
+          <w:tcPr>
+            <w:tcW w:type="dxa" w:w="1560"/>
+          </w:tcPr>
+          <w:p>
+            <w:r>
+              <w:t>NMI</w:t>
+            </w:r>
+          </w:p>
+        </w:tc>
+      </w:tr>
+      <w:tr>
+        <w:tc>
+          <w:tcPr>
+            <w:tcW w:type="dxa" w:w="1560"/>
+          </w:tcPr>
+          <w:p>
+            <w:r>
+              <w:t>Synthetic</w:t>
+            </w:r>
+          </w:p>
+        </w:tc>
+        <w:tc>
+          <w:tcPr>
+            <w:tcW w:type="dxa" w:w="1560"/>
+          </w:tcPr>
+          <w:p>
+            <w:r>
+              <w:t>Traditional</w:t>
+            </w:r>
+          </w:p>
+        </w:tc>
+        <w:tc>
+          <w:tcPr>
+            <w:tcW w:type="dxa" w:w="1560"/>
+          </w:tcPr>
+          <w:p>
+            <w:r>
+              <w:t>1,032.370</w:t>
+            </w:r>
+          </w:p>
+        </w:tc>
+        <w:tc>
+          <w:tcPr>
+            <w:tcW w:type="dxa" w:w="1560"/>
+          </w:tcPr>
+          <w:p>
+            <w:r>
+              <w:t>1.0000</w:t>
+            </w:r>
+          </w:p>
+        </w:tc>
+        <w:tc>
+          <w:tcPr>
+            <w:tcW w:type="dxa" w:w="1560"/>
+          </w:tcPr>
+          <w:p>
+            <w:r>
+              <w:t>1.0000</w:t>
+            </w:r>
+          </w:p>
+        </w:tc>
+        <w:tc>
+          <w:tcPr>
+            <w:tcW w:type="dxa" w:w="1560"/>
+          </w:tcPr>
+          <w:p>
+            <w:r>
+              <w:t>1.0000</w:t>
+            </w:r>
+          </w:p>
+        </w:tc>
+      </w:tr>
+      <w:tr>
+        <w:tc>
+          <w:tcPr>
+            <w:tcW w:type="dxa" w:w="1560"/>
+          </w:tcPr>
+          <w:p>
+            <w:r>
+              <w:t>Synthetic</w:t>
+            </w:r>
+          </w:p>
+        </w:tc>
+        <w:tc>
+          <w:tcPr>
+            <w:tcW w:type="dxa" w:w="1560"/>
+          </w:tcPr>
+          <w:p>
+            <w:r>
+              <w:t>Spark local[1]</w:t>
+            </w:r>
+          </w:p>
+        </w:tc>
+        <w:tc>
+          <w:tcPr>
+            <w:tcW w:type="dxa" w:w="1560"/>
+          </w:tcPr>
+          <w:p>
+            <w:r>
+              <w:t>1,032.370</w:t>
+            </w:r>
+          </w:p>
+        </w:tc>
+        <w:tc>
+          <w:tcPr>
+            <w:tcW w:type="dxa" w:w="1560"/>
+          </w:tcPr>
+          <w:p>
+            <w:r>
+              <w:t>1.0000</w:t>
+            </w:r>
+          </w:p>
+        </w:tc>
+        <w:tc>
+          <w:tcPr>
+            <w:tcW w:type="dxa" w:w="1560"/>
+          </w:tcPr>
+          <w:p>
+            <w:r>
+              <w:t>1.0000</w:t>
+            </w:r>
+          </w:p>
+        </w:tc>
+        <w:tc>
+          <w:tcPr>
+            <w:tcW w:type="dxa" w:w="1560"/>
+          </w:tcPr>
+          <w:p>
+            <w:r>
+              <w:t>1.0000</w:t>
+            </w:r>
+          </w:p>
+        </w:tc>
+      </w:tr>
+      <w:tr>
+        <w:tc>
+          <w:tcPr>
+            <w:tcW w:type="dxa" w:w="1560"/>
+          </w:tcPr>
+          <w:p>
+            <w:r>
+              <w:t>Synthetic</w:t>
+            </w:r>
+          </w:p>
+        </w:tc>
+        <w:tc>
+          <w:tcPr>
+            <w:tcW w:type="dxa" w:w="1560"/>
+          </w:tcPr>
+          <w:p>
+            <w:r>
+              <w:t>Spark local[2]</w:t>
+            </w:r>
+          </w:p>
+        </w:tc>
+        <w:tc>
+          <w:tcPr>
+            <w:tcW w:type="dxa" w:w="1560"/>
+          </w:tcPr>
+          <w:p>
+            <w:r>
+              <w:t>1,032.370</w:t>
+            </w:r>
+          </w:p>
+        </w:tc>
+        <w:tc>
+          <w:tcPr>
+            <w:tcW w:type="dxa" w:w="1560"/>
+          </w:tcPr>
+          <w:p>
+            <w:r>
+              <w:t>1.0000</w:t>
+            </w:r>
+          </w:p>
+        </w:tc>
+        <w:tc>
+          <w:tcPr>
+            <w:tcW w:type="dxa" w:w="1560"/>
+          </w:tcPr>
+          <w:p>
+            <w:r>
+              <w:t>1.0000</w:t>
+            </w:r>
+          </w:p>
+        </w:tc>
+        <w:tc>
+          <w:tcPr>
+            <w:tcW w:type="dxa" w:w="1560"/>
+          </w:tcPr>
+          <w:p>
+            <w:r>
+              <w:t>1.0000</w:t>
+            </w:r>
+          </w:p>
+        </w:tc>
+      </w:tr>
+      <w:tr>
+        <w:tc>
+          <w:tcPr>
+            <w:tcW w:type="dxa" w:w="1560"/>
+          </w:tcPr>
+          <w:p>
+            <w:r>
+              <w:t>KDD99</w:t>
+            </w:r>
+          </w:p>
+        </w:tc>
+        <w:tc>
+          <w:tcPr>
+            <w:tcW w:type="dxa" w:w="1560"/>
+          </w:tcPr>
+          <w:p>
+            <w:r>
+              <w:t>Traditional</w:t>
+            </w:r>
+          </w:p>
+        </w:tc>
+        <w:tc>
+          <w:tcPr>
+            <w:tcW w:type="dxa" w:w="1560"/>
+          </w:tcPr>
+          <w:p>
+            <w:r>
+              <w:t>9,342.830</w:t>
+            </w:r>
+          </w:p>
+        </w:tc>
+        <w:tc>
+          <w:tcPr>
+            <w:tcW w:type="dxa" w:w="1560"/>
+          </w:tcPr>
+          <w:p>
+            <w:r>
+              <w:t>0.9750</w:t>
+            </w:r>
+          </w:p>
+        </w:tc>
+        <w:tc>
+          <w:tcPr>
+            <w:tcW w:type="dxa" w:w="1560"/>
+          </w:tcPr>
+          <w:p>
+            <w:r>
+              <w:t>0.4318</w:t>
+            </w:r>
+          </w:p>
+        </w:tc>
+        <w:tc>
+          <w:tcPr>
+            <w:tcW w:type="dxa" w:w="1560"/>
+          </w:tcPr>
+          <w:p>
+            <w:r>
+              <w:t>0.5352</w:t>
+            </w:r>
+          </w:p>
+        </w:tc>
+      </w:tr>
+      <w:tr>
+        <w:tc>
+          <w:tcPr>
+            <w:tcW w:type="dxa" w:w="1560"/>
+          </w:tcPr>
+          <w:p>
+            <w:r>
+              <w:t>KDD99</w:t>
+            </w:r>
+          </w:p>
+        </w:tc>
+        <w:tc>
+          <w:tcPr>
+            <w:tcW w:type="dxa" w:w="1560"/>
+          </w:tcPr>
+          <w:p>
+            <w:r>
+              <w:t>Spark local[1]</w:t>
+            </w:r>
+          </w:p>
+        </w:tc>
+        <w:tc>
+          <w:tcPr>
+            <w:tcW w:type="dxa" w:w="1560"/>
+          </w:tcPr>
+          <w:p>
+            <w:r>
+              <w:t>21,072.555</w:t>
+            </w:r>
+          </w:p>
+        </w:tc>
+        <w:tc>
+          <w:tcPr>
+            <w:tcW w:type="dxa" w:w="1560"/>
+          </w:tcPr>
+          <w:p>
+            <w:r>
+              <w:t>0.7970</w:t>
+            </w:r>
+          </w:p>
+        </w:tc>
+        <w:tc>
+          <w:tcPr>
+            <w:tcW w:type="dxa" w:w="1560"/>
+          </w:tcPr>
+          <w:p>
+            <w:r>
+              <w:t>-0.0054</w:t>
+            </w:r>
+          </w:p>
+        </w:tc>
+        <w:tc>
+          <w:tcPr>
+            <w:tcW w:type="dxa" w:w="1560"/>
+          </w:tcPr>
+          <w:p>
+            <w:r>
+              <w:t>0.0111</w:t>
+            </w:r>
+          </w:p>
+        </w:tc>
+      </w:tr>
+      <w:tr>
+        <w:tc>
+          <w:tcPr>
+            <w:tcW w:type="dxa" w:w="1560"/>
+          </w:tcPr>
+          <w:p>
+            <w:r>
+              <w:t>KDD99</w:t>
+            </w:r>
+          </w:p>
+        </w:tc>
+        <w:tc>
+          <w:tcPr>
+            <w:tcW w:type="dxa" w:w="1560"/>
+          </w:tcPr>
+          <w:p>
+            <w:r>
+              <w:t>Spark local[2]</w:t>
+            </w:r>
+          </w:p>
+        </w:tc>
+        <w:tc>
+          <w:tcPr>
+            <w:tcW w:type="dxa" w:w="1560"/>
+          </w:tcPr>
+          <w:p>
+            <w:r>
+              <w:t>21,072.555</w:t>
+            </w:r>
+          </w:p>
+        </w:tc>
+        <w:tc>
+          <w:tcPr>
+            <w:tcW w:type="dxa" w:w="1560"/>
+          </w:tcPr>
+          <w:p>
+            <w:r>
+              <w:t>0.7970</w:t>
+            </w:r>
+          </w:p>
+        </w:tc>
+        <w:tc>
+          <w:tcPr>
+            <w:tcW w:type="dxa" w:w="1560"/>
+          </w:tcPr>
+          <w:p>
+            <w:r>
+              <w:t>-0.0054</w:t>
+            </w:r>
+          </w:p>
+        </w:tc>
+        <w:tc>
+          <w:tcPr>
+            <w:tcW w:type="dxa" w:w="1560"/>
+          </w:tcPr>
+          <w:p>
+            <w:r>
+              <w:t>0.0111</w:t>
+            </w:r>
+          </w:p>
+        </w:tc>
+      </w:tr>
+    </w:tbl>
+    <w:p>
+      <w:r>
+        <w:t>Verification procedure. Final Spark centers were used to independently reassign all 1,000 records to their nearest center and recompute the sum of squared Euclidean distances. The recalculated SSE, assignments, and per-cluster counts matched the Spark evaluation output in all four runs. Ground-truth labels were used only to calculate external evaluation measures (Purity, adjusted Rand index, and normalized mutual information).</w:t>
+      </w:r>
+    </w:p>
+    <w:p>
+      <w:r>
+        <w:t>Interpretation. The synthetic verification reproduced the traditional baseline exactly on the reported measures. On KDD99, Spark produced a higher SSE and substantially weaker external-label agreement than the traditional baseline for this particular five-cluster configuration. KDD99 is highly imbalanced: the largest true class contains 795 of 1,000 observations, so assigning all records to one cluster would yield a purity of 0.795. The Spark purity of 0.797 is only marginally above that reference, consistent with ARI near zero and NMI near zero. Convergence does not establish clustering quality. These observations do not identify a single causal mechanism; initialization, preprocessing, partitioning, and class imbalance warrant follow-up investigation.</w:t>
+      </w:r>
+    </w:p>
+    <w:p>
+      <w:r>
+        <w:t>Scope and timing. Spark local[1] and local[2] are single-computer configurations, not separate physical nodes. The four verification runs are a supplemental correctness/quality check, not part of the 42 controlled experiments or the 18 historical scalability runs. The supplementary wall-clock measurements include verification-run overhead and should not be directly compared with the earlier benchmark timing definitions. The six-row result table is saved as results/verified_quality/clustering_quality_comparison.csv (Git commit 78fd4e2).</w:t>
       </w:r>
     </w:p>
     <w:p>

</xml_diff>